<commit_message>
fix: change database and refactor db in progres
</commit_message>
<xml_diff>
--- a/progress-report/BaoCaoTienDo02-08-06.docx
+++ b/progress-report/BaoCaoTienDo02-08-06.docx
@@ -445,14 +445,13 @@
       <w:r>
         <w:rPr>
           <w:noProof/>
-          <w:szCs w:val="26"/>
         </w:rPr>
         <w:lastRenderedPageBreak/>
         <w:drawing>
-          <wp:inline distT="0" distB="0" distL="0" distR="0" wp14:anchorId="1004477C" wp14:editId="13C95C35">
-            <wp:extent cx="5473065" cy="3650615"/>
-            <wp:effectExtent l="0" t="0" r="0" b="6985"/>
-            <wp:docPr id="1234005007" name="Picture 2"/>
+          <wp:inline distT="0" distB="0" distL="0" distR="0" wp14:anchorId="01158CCC" wp14:editId="5E1EB41A">
+            <wp:extent cx="5943600" cy="3958590"/>
+            <wp:effectExtent l="0" t="0" r="0" b="3810"/>
+            <wp:docPr id="1704237241" name="Picture 2"/>
             <wp:cNvGraphicFramePr>
               <a:graphicFrameLocks xmlns:a="http://schemas.openxmlformats.org/drawingml/2006/main" noChangeAspect="1"/>
             </wp:cNvGraphicFramePr>
@@ -460,36 +459,29 @@
               <a:graphicData uri="http://schemas.openxmlformats.org/drawingml/2006/picture">
                 <pic:pic xmlns:pic="http://schemas.openxmlformats.org/drawingml/2006/picture">
                   <pic:nvPicPr>
-                    <pic:cNvPr id="0" name="Picture 3"/>
-                    <pic:cNvPicPr>
-                      <a:picLocks noChangeAspect="1" noChangeArrowheads="1"/>
-                    </pic:cNvPicPr>
+                    <pic:cNvPr id="1704237241" name="Picture 1704237241"/>
+                    <pic:cNvPicPr/>
                   </pic:nvPicPr>
                   <pic:blipFill>
-                    <a:blip r:embed="rId6" cstate="print">
+                    <a:blip r:embed="rId6">
                       <a:extLst>
                         <a:ext uri="{28A0092B-C50C-407E-A947-70E740481C1C}">
                           <a14:useLocalDpi xmlns:a14="http://schemas.microsoft.com/office/drawing/2010/main" val="0"/>
                         </a:ext>
                       </a:extLst>
                     </a:blip>
-                    <a:srcRect/>
                     <a:stretch>
                       <a:fillRect/>
                     </a:stretch>
                   </pic:blipFill>
-                  <pic:spPr bwMode="auto">
+                  <pic:spPr>
                     <a:xfrm>
                       <a:off x="0" y="0"/>
-                      <a:ext cx="5473065" cy="3650615"/>
+                      <a:ext cx="5943600" cy="3958590"/>
                     </a:xfrm>
                     <a:prstGeom prst="rect">
                       <a:avLst/>
                     </a:prstGeom>
-                    <a:noFill/>
-                    <a:ln>
-                      <a:noFill/>
-                    </a:ln>
                   </pic:spPr>
                 </pic:pic>
               </a:graphicData>
@@ -515,7 +507,13 @@
     </w:p>
     <w:p>
       <w:r>
-        <w:t xml:space="preserve">Cơ sở dữ liệu được thiết kế trên hệ quản trị MySQL, tổ chức thành các bảng có liên kết chặt chẽ thông qua khóa chính và khóa ngoại. </w:t>
+        <w:t xml:space="preserve">Cơ sở dữ liệu được thiết kế trên hệ quản trị </w:t>
+      </w:r>
+      <w:r>
+        <w:t>SQL Server</w:t>
+      </w:r>
+      <w:r>
+        <w:t xml:space="preserve">, tổ chức thành các bảng có liên kết chặt chẽ thông qua khóa chính và khóa ngoại. </w:t>
       </w:r>
     </w:p>
     <w:p>
@@ -574,24 +572,6 @@
     </w:p>
     <w:p>
       <w:pPr>
-        <w:numPr>
-          <w:ilvl w:val="0"/>
-          <w:numId w:val="5"/>
-        </w:numPr>
-      </w:pPr>
-      <w:r>
-        <w:rPr>
-          <w:b/>
-          <w:bCs/>
-        </w:rPr>
-        <w:t>Bảng Khuyến mãi &amp; Thanh toán:</w:t>
-      </w:r>
-      <w:r>
-        <w:t xml:space="preserve"> Gồm vouchers, voucher_usage, payment_methods lưu thông tin mã giảm giá, lịch sử sử dụng và cấu hình các cổng thanh toán. </w:t>
-      </w:r>
-    </w:p>
-    <w:p>
-      <w:pPr>
         <w:ind w:left="360"/>
       </w:pPr>
       <w:r>
@@ -600,10 +580,10 @@
         </w:rPr>
         <w:lastRenderedPageBreak/>
         <w:drawing>
-          <wp:inline distT="0" distB="0" distL="0" distR="0" wp14:anchorId="4FF10325" wp14:editId="06089F06">
-            <wp:extent cx="5561330" cy="6155055"/>
-            <wp:effectExtent l="0" t="0" r="1270" b="0"/>
-            <wp:docPr id="1922828944" name="Picture 3"/>
+          <wp:inline distT="0" distB="0" distL="0" distR="0" wp14:anchorId="5E4E01C2" wp14:editId="588FBABB">
+            <wp:extent cx="5943600" cy="3341370"/>
+            <wp:effectExtent l="0" t="0" r="0" b="0"/>
+            <wp:docPr id="1282161966" name="Picture 1"/>
             <wp:cNvGraphicFramePr>
               <a:graphicFrameLocks xmlns:a="http://schemas.openxmlformats.org/drawingml/2006/main" noChangeAspect="1"/>
             </wp:cNvGraphicFramePr>
@@ -611,36 +591,29 @@
               <a:graphicData uri="http://schemas.openxmlformats.org/drawingml/2006/picture">
                 <pic:pic xmlns:pic="http://schemas.openxmlformats.org/drawingml/2006/picture">
                   <pic:nvPicPr>
-                    <pic:cNvPr id="0" name="Picture 5"/>
-                    <pic:cNvPicPr>
-                      <a:picLocks noChangeAspect="1" noChangeArrowheads="1"/>
-                    </pic:cNvPicPr>
+                    <pic:cNvPr id="1282161966" name="Picture 1282161966"/>
+                    <pic:cNvPicPr/>
                   </pic:nvPicPr>
                   <pic:blipFill>
-                    <a:blip r:embed="rId7" cstate="print">
+                    <a:blip r:embed="rId7">
                       <a:extLst>
                         <a:ext uri="{28A0092B-C50C-407E-A947-70E740481C1C}">
                           <a14:useLocalDpi xmlns:a14="http://schemas.microsoft.com/office/drawing/2010/main" val="0"/>
                         </a:ext>
                       </a:extLst>
                     </a:blip>
-                    <a:srcRect/>
                     <a:stretch>
                       <a:fillRect/>
                     </a:stretch>
                   </pic:blipFill>
-                  <pic:spPr bwMode="auto">
+                  <pic:spPr>
                     <a:xfrm>
                       <a:off x="0" y="0"/>
-                      <a:ext cx="5561330" cy="6155055"/>
+                      <a:ext cx="5943600" cy="3341370"/>
                     </a:xfrm>
                     <a:prstGeom prst="rect">
                       <a:avLst/>
                     </a:prstGeom>
-                    <a:noFill/>
-                    <a:ln>
-                      <a:noFill/>
-                    </a:ln>
                   </pic:spPr>
                 </pic:pic>
               </a:graphicData>
@@ -695,7 +668,6 @@
         <w:rPr>
           <w:noProof/>
         </w:rPr>
-        <w:lastRenderedPageBreak/>
         <w:drawing>
           <wp:inline distT="0" distB="0" distL="0" distR="0" wp14:anchorId="0484E516" wp14:editId="159C8317">
             <wp:extent cx="5943600" cy="3317875"/>
@@ -745,6 +717,7 @@
           <w:b/>
           <w:bCs/>
         </w:rPr>
+        <w:lastRenderedPageBreak/>
         <w:t>Đăng nhập / Đăng xuất:</w:t>
       </w:r>
       <w:r>
@@ -822,7 +795,6 @@
         <w:rPr>
           <w:noProof/>
         </w:rPr>
-        <w:lastRenderedPageBreak/>
         <w:drawing>
           <wp:inline distT="0" distB="0" distL="0" distR="0" wp14:anchorId="76D4F0FE" wp14:editId="10165F8F">
             <wp:extent cx="5943600" cy="3187065"/>

</xml_diff>